<commit_message>
killing off the decision matrix. doesn't fit these scenarios
</commit_message>
<xml_diff>
--- a/TechComm/assignments/recommendation/individual/rubric/RecommendationReportRubric-f26.docx
+++ b/TechComm/assignments/recommendation/individual/rubric/RecommendationReportRubric-f26.docx
@@ -19,7 +19,8 @@
     </w:p>
     <w:tbl>
       <w:tblPr>
-        <w:tblW w:w="11580" w:type="dxa"/>
+        <w:tblW w:w="17100" w:type="dxa"/>
+        <w:tblInd w:w="-8" w:type="dxa"/>
         <w:shd w:val="clear" w:color="auto" w:fill="FFFFFF"/>
         <w:tblCellMar>
           <w:top w:w="15" w:type="dxa"/>
@@ -30,153 +31,12 @@
         <w:tblLook w:val="04A0" w:firstRow="1" w:lastRow="0" w:firstColumn="1" w:lastColumn="0" w:noHBand="0" w:noVBand="1"/>
       </w:tblPr>
       <w:tblGrid>
-        <w:gridCol w:w="4396"/>
-        <w:gridCol w:w="6303"/>
-        <w:gridCol w:w="881"/>
+        <w:gridCol w:w="3843"/>
+        <w:gridCol w:w="13257"/>
       </w:tblGrid>
       <w:tr>
         <w:trPr>
-          <w:tblHeader/>
-        </w:trPr>
-        <w:tc>
-          <w:tcPr>
-            <w:tcW w:w="0" w:type="auto"/>
-            <w:gridSpan w:val="3"/>
-            <w:tcBorders>
-              <w:top w:val="nil"/>
-              <w:left w:val="nil"/>
-              <w:bottom w:val="nil"/>
-              <w:right w:val="nil"/>
-            </w:tcBorders>
-            <w:tcMar>
-              <w:top w:w="105" w:type="dxa"/>
-              <w:left w:w="150" w:type="dxa"/>
-              <w:bottom w:w="105" w:type="dxa"/>
-              <w:right w:w="150" w:type="dxa"/>
-            </w:tcMar>
-            <w:vAlign w:val="center"/>
-            <w:hideMark/>
-          </w:tcPr>
-          <w:p>
-            <w:r>
-              <w:t>Recommendation Report Rubric</w:t>
-            </w:r>
-          </w:p>
-        </w:tc>
-      </w:tr>
-      <w:tr>
-        <w:trPr>
-          <w:tblHeader/>
-        </w:trPr>
-        <w:tc>
-          <w:tcPr>
-            <w:tcW w:w="0" w:type="auto"/>
-            <w:tcBorders>
-              <w:top w:val="single" w:sz="6" w:space="0" w:color="E8EAEC"/>
-              <w:left w:val="single" w:sz="6" w:space="0" w:color="E8EAEC"/>
-              <w:bottom w:val="single" w:sz="6" w:space="0" w:color="E8EAEC"/>
-              <w:right w:val="single" w:sz="6" w:space="0" w:color="E8EAEC"/>
-            </w:tcBorders>
-            <w:shd w:val="clear" w:color="auto" w:fill="F2F4F4"/>
-            <w:tcMar>
-              <w:top w:w="105" w:type="dxa"/>
-              <w:left w:w="150" w:type="dxa"/>
-              <w:bottom w:w="105" w:type="dxa"/>
-              <w:right w:w="150" w:type="dxa"/>
-            </w:tcMar>
-            <w:vAlign w:val="center"/>
-            <w:hideMark/>
-          </w:tcPr>
-          <w:p>
-            <w:pPr>
-              <w:rPr>
-                <w:b/>
-                <w:bCs/>
-              </w:rPr>
-            </w:pPr>
-            <w:r>
-              <w:rPr>
-                <w:b/>
-                <w:bCs/>
-              </w:rPr>
-              <w:t>Criteria</w:t>
-            </w:r>
-          </w:p>
-        </w:tc>
-        <w:tc>
-          <w:tcPr>
-            <w:tcW w:w="0" w:type="auto"/>
-            <w:tcBorders>
-              <w:top w:val="single" w:sz="6" w:space="0" w:color="E8EAEC"/>
-              <w:left w:val="single" w:sz="6" w:space="0" w:color="E8EAEC"/>
-              <w:bottom w:val="single" w:sz="6" w:space="0" w:color="E8EAEC"/>
-              <w:right w:val="single" w:sz="6" w:space="0" w:color="E8EAEC"/>
-            </w:tcBorders>
-            <w:shd w:val="clear" w:color="auto" w:fill="F2F4F4"/>
-            <w:tcMar>
-              <w:top w:w="105" w:type="dxa"/>
-              <w:left w:w="150" w:type="dxa"/>
-              <w:bottom w:w="105" w:type="dxa"/>
-              <w:right w:w="150" w:type="dxa"/>
-            </w:tcMar>
-            <w:vAlign w:val="center"/>
-            <w:hideMark/>
-          </w:tcPr>
-          <w:p>
-            <w:pPr>
-              <w:rPr>
-                <w:b/>
-                <w:bCs/>
-              </w:rPr>
-            </w:pPr>
-            <w:r>
-              <w:rPr>
-                <w:b/>
-                <w:bCs/>
-              </w:rPr>
-              <w:t>Ratings</w:t>
-            </w:r>
-          </w:p>
-        </w:tc>
-        <w:tc>
-          <w:tcPr>
-            <w:tcW w:w="0" w:type="auto"/>
-            <w:tcBorders>
-              <w:top w:val="single" w:sz="6" w:space="0" w:color="E8EAEC"/>
-              <w:left w:val="single" w:sz="6" w:space="0" w:color="E8EAEC"/>
-              <w:bottom w:val="single" w:sz="6" w:space="0" w:color="E8EAEC"/>
-              <w:right w:val="single" w:sz="6" w:space="0" w:color="E8EAEC"/>
-            </w:tcBorders>
-            <w:shd w:val="clear" w:color="auto" w:fill="F2F4F4"/>
-            <w:tcMar>
-              <w:top w:w="105" w:type="dxa"/>
-              <w:left w:w="150" w:type="dxa"/>
-              <w:bottom w:w="105" w:type="dxa"/>
-              <w:right w:w="150" w:type="dxa"/>
-            </w:tcMar>
-            <w:vAlign w:val="center"/>
-            <w:hideMark/>
-          </w:tcPr>
-          <w:p>
-            <w:pPr>
-              <w:rPr>
-                <w:b/>
-                <w:bCs/>
-              </w:rPr>
-            </w:pPr>
-            <w:r>
-              <w:rPr>
-                <w:b/>
-                <w:bCs/>
-              </w:rPr>
-              <w:t>Pts</w:t>
-            </w:r>
-          </w:p>
-        </w:tc>
-      </w:tr>
-      <w:tr>
-        <w:trPr>
-          <w:trHeight w:val="8990"/>
+          <w:trHeight w:val="20"/>
         </w:trPr>
         <w:tc>
           <w:tcPr>
@@ -198,7 +58,7 @@
           </w:tcPr>
           <w:p>
             <w:r>
-              <w:t>This criterion is linked to a Learning OutcomeThe Basics: Minimum Requirements</w:t>
+              <w:t>The Basics: Minimum Requirements</w:t>
             </w:r>
           </w:p>
           <w:p>
@@ -209,7 +69,7 @@
         </w:tc>
         <w:tc>
           <w:tcPr>
-            <w:tcW w:w="0" w:type="auto"/>
+            <w:tcW w:w="13257" w:type="dxa"/>
             <w:tcBorders>
               <w:top w:val="single" w:sz="6" w:space="0" w:color="E8EAEC"/>
               <w:left w:val="single" w:sz="6" w:space="0" w:color="E8EAEC"/>
@@ -223,7 +83,6 @@
               <w:bottom w:w="0" w:type="dxa"/>
               <w:right w:w="0" w:type="dxa"/>
             </w:tcMar>
-            <w:vAlign w:val="center"/>
             <w:hideMark/>
           </w:tcPr>
           <w:p>
@@ -238,10 +97,38 @@
                 <w:b/>
                 <w:bCs/>
               </w:rPr>
-              <w:t>75 ptsNear Complete</w:t>
-            </w:r>
-            <w:r>
-              <w:t>A minor baseline requirement is missing or incomplete, but the report is substantially complete.</w:t>
+              <w:t xml:space="preserve">75 </w:t>
+            </w:r>
+            <w:proofErr w:type="spellStart"/>
+            <w:r>
+              <w:rPr>
+                <w:b/>
+                <w:bCs/>
+              </w:rPr>
+              <w:t>ptsNear</w:t>
+            </w:r>
+            <w:proofErr w:type="spellEnd"/>
+            <w:r>
+              <w:rPr>
+                <w:b/>
+                <w:bCs/>
+              </w:rPr>
+              <w:t xml:space="preserve"> </w:t>
+            </w:r>
+            <w:proofErr w:type="spellStart"/>
+            <w:r>
+              <w:rPr>
+                <w:b/>
+                <w:bCs/>
+              </w:rPr>
+              <w:t>Complete</w:t>
+            </w:r>
+            <w:r>
+              <w:t>A</w:t>
+            </w:r>
+            <w:proofErr w:type="spellEnd"/>
+            <w:r>
+              <w:t xml:space="preserve"> minor baseline requirement is missing or incomplete, but the report is substantially complete.</w:t>
             </w:r>
           </w:p>
           <w:p>
@@ -256,11 +143,44 @@
                 <w:b/>
                 <w:bCs/>
               </w:rPr>
-              <w:t>65 ptsPartially Complete</w:t>
-            </w:r>
-            <w:r>
-              <w:t>Several essential elements are missing or incomplete, such as required sections, research, visuals, or the decision matrix.</w:t>
-            </w:r>
+              <w:t xml:space="preserve">65 </w:t>
+            </w:r>
+            <w:proofErr w:type="spellStart"/>
+            <w:r>
+              <w:rPr>
+                <w:b/>
+                <w:bCs/>
+              </w:rPr>
+              <w:t>ptsPartially</w:t>
+            </w:r>
+            <w:proofErr w:type="spellEnd"/>
+            <w:r>
+              <w:rPr>
+                <w:b/>
+                <w:bCs/>
+              </w:rPr>
+              <w:t xml:space="preserve"> </w:t>
+            </w:r>
+            <w:proofErr w:type="spellStart"/>
+            <w:r>
+              <w:rPr>
+                <w:b/>
+                <w:bCs/>
+              </w:rPr>
+              <w:t>Complete</w:t>
+            </w:r>
+            <w:r>
+              <w:t>Several</w:t>
+            </w:r>
+            <w:proofErr w:type="spellEnd"/>
+            <w:r>
+              <w:t xml:space="preserve"> essential elements are missing or incomplete, such as required sections, research, </w:t>
+            </w:r>
+            <w:proofErr w:type="gramStart"/>
+            <w:r>
+              <w:t>visuals,.</w:t>
+            </w:r>
+            <w:proofErr w:type="gramEnd"/>
           </w:p>
           <w:p>
             <w:pPr>
@@ -274,10 +194,38 @@
                 <w:b/>
                 <w:bCs/>
               </w:rPr>
-              <w:t>55 ptsMostly Incomplete</w:t>
-            </w:r>
-            <w:r>
-              <w:t>Major requirements are missing; the report is substantially incomplete, uses the wrong project or genre, or does not present a meaningful evaluation and recommendations.</w:t>
+              <w:t xml:space="preserve">55 </w:t>
+            </w:r>
+            <w:proofErr w:type="spellStart"/>
+            <w:r>
+              <w:rPr>
+                <w:b/>
+                <w:bCs/>
+              </w:rPr>
+              <w:t>ptsMostly</w:t>
+            </w:r>
+            <w:proofErr w:type="spellEnd"/>
+            <w:r>
+              <w:rPr>
+                <w:b/>
+                <w:bCs/>
+              </w:rPr>
+              <w:t xml:space="preserve"> </w:t>
+            </w:r>
+            <w:proofErr w:type="spellStart"/>
+            <w:r>
+              <w:rPr>
+                <w:b/>
+                <w:bCs/>
+              </w:rPr>
+              <w:t>Incomplete</w:t>
+            </w:r>
+            <w:r>
+              <w:t>Major</w:t>
+            </w:r>
+            <w:proofErr w:type="spellEnd"/>
+            <w:r>
+              <w:t xml:space="preserve"> requirements are missing; the report is substantially incomplete, uses the wrong project or genre, or does not present a meaningful evaluation and recommendations.</w:t>
             </w:r>
           </w:p>
           <w:p>
@@ -292,46 +240,45 @@
                 <w:b/>
                 <w:bCs/>
               </w:rPr>
-              <w:t>0 ptsMeets Requirements</w:t>
-            </w:r>
-            <w:r>
-              <w:t>Meets all basic requirements: same assigned client document; 9–15 pages (longer allowed); workplace recommendation report addressed to the client key contact; all 11 required sections; decision matrix plus at least three relevant additional visuals; at least six outside sources with in-text citations and references; PDF submission; required layout and page numbering. Optional sections are not required.</w:t>
-            </w:r>
-          </w:p>
-        </w:tc>
-        <w:tc>
-          <w:tcPr>
-            <w:tcW w:w="0" w:type="auto"/>
-            <w:tcBorders>
-              <w:top w:val="single" w:sz="6" w:space="0" w:color="E8EAEC"/>
-              <w:left w:val="single" w:sz="6" w:space="0" w:color="E8EAEC"/>
-              <w:bottom w:val="single" w:sz="6" w:space="0" w:color="E8EAEC"/>
-              <w:right w:val="single" w:sz="6" w:space="0" w:color="E8EAEC"/>
-            </w:tcBorders>
-            <w:shd w:val="clear" w:color="auto" w:fill="FFFFFF"/>
-            <w:noWrap/>
-            <w:tcMar>
-              <w:top w:w="105" w:type="dxa"/>
-              <w:left w:w="150" w:type="dxa"/>
-              <w:bottom w:w="105" w:type="dxa"/>
-              <w:right w:w="150" w:type="dxa"/>
-            </w:tcMar>
-            <w:vAlign w:val="center"/>
-            <w:hideMark/>
-          </w:tcPr>
-          <w:p>
-            <w:r>
-              <w:t>75 pts</w:t>
-            </w:r>
-            <w:r>
-              <w:br/>
+              <w:t xml:space="preserve">0 </w:t>
+            </w:r>
+            <w:proofErr w:type="spellStart"/>
+            <w:r>
+              <w:rPr>
+                <w:b/>
+                <w:bCs/>
+              </w:rPr>
+              <w:t>ptsMeets</w:t>
+            </w:r>
+            <w:proofErr w:type="spellEnd"/>
+            <w:r>
+              <w:rPr>
+                <w:b/>
+                <w:bCs/>
+              </w:rPr>
+              <w:t xml:space="preserve"> </w:t>
+            </w:r>
+            <w:proofErr w:type="spellStart"/>
+            <w:r>
+              <w:rPr>
+                <w:b/>
+                <w:bCs/>
+              </w:rPr>
+              <w:t>Requirements</w:t>
+            </w:r>
+            <w:r>
+              <w:t>Meets</w:t>
+            </w:r>
+            <w:proofErr w:type="spellEnd"/>
+            <w:r>
+              <w:t xml:space="preserve"> all basic requirements: same assigned client document; 9–15 pages (longer allowed); workplace recommendation report addressed to the client key contact; all 11 required sections; at least three relevant visuals; at least six outside sources with in-text citations and references; PDF submission; required layout and page numbering. Optional sections are not required.</w:t>
             </w:r>
           </w:p>
         </w:tc>
       </w:tr>
       <w:tr>
         <w:trPr>
-          <w:trHeight w:val="5014"/>
+          <w:trHeight w:val="20"/>
         </w:trPr>
         <w:tc>
           <w:tcPr>
@@ -353,8 +300,7 @@
           </w:tcPr>
           <w:p>
             <w:r>
-              <w:lastRenderedPageBreak/>
-              <w:t>This criterion is linked to a Learning OutcomeInvestigation, Methods &amp; Evaluation Criteria</w:t>
+              <w:t>Investigation, Methods &amp; Evaluation Criteria</w:t>
             </w:r>
           </w:p>
           <w:p>
@@ -365,7 +311,7 @@
         </w:tc>
         <w:tc>
           <w:tcPr>
-            <w:tcW w:w="0" w:type="auto"/>
+            <w:tcW w:w="13257" w:type="dxa"/>
             <w:tcBorders>
               <w:top w:val="single" w:sz="6" w:space="0" w:color="E8EAEC"/>
               <w:left w:val="single" w:sz="6" w:space="0" w:color="E8EAEC"/>
@@ -379,7 +325,6 @@
               <w:bottom w:w="0" w:type="dxa"/>
               <w:right w:w="0" w:type="dxa"/>
             </w:tcMar>
-            <w:vAlign w:val="center"/>
             <w:hideMark/>
           </w:tcPr>
           <w:p>
@@ -394,10 +339,38 @@
                 <w:b/>
                 <w:bCs/>
               </w:rPr>
-              <w:t>20 ptsMeets or Exceeds</w:t>
-            </w:r>
-            <w:r>
-              <w:t>Methods are clear, appropriate, and sufficiently detailed to explain how the document was investigated. Evaluation criteria are explicit, relevant to the client document and users, and grounded in credible standards or research.</w:t>
+              <w:t xml:space="preserve">20 </w:t>
+            </w:r>
+            <w:proofErr w:type="spellStart"/>
+            <w:r>
+              <w:rPr>
+                <w:b/>
+                <w:bCs/>
+              </w:rPr>
+              <w:t>ptsMeets</w:t>
+            </w:r>
+            <w:proofErr w:type="spellEnd"/>
+            <w:r>
+              <w:rPr>
+                <w:b/>
+                <w:bCs/>
+              </w:rPr>
+              <w:t xml:space="preserve"> or </w:t>
+            </w:r>
+            <w:proofErr w:type="spellStart"/>
+            <w:r>
+              <w:rPr>
+                <w:b/>
+                <w:bCs/>
+              </w:rPr>
+              <w:t>Exceeds</w:t>
+            </w:r>
+            <w:r>
+              <w:t>Methods</w:t>
+            </w:r>
+            <w:proofErr w:type="spellEnd"/>
+            <w:r>
+              <w:t xml:space="preserve"> are clear, appropriate, and sufficiently detailed to explain how the document was investigated. Evaluation criteria are explicit, relevant to the client document and users, and grounded in credible standards or research.</w:t>
             </w:r>
           </w:p>
           <w:p>
@@ -412,10 +385,38 @@
                 <w:b/>
                 <w:bCs/>
               </w:rPr>
-              <w:t>17 ptsAlmost There</w:t>
-            </w:r>
-            <w:r>
-              <w:t>Methods and criteria are generally appropriate, but their rationale, specificity, or connection to research needs development.</w:t>
+              <w:t xml:space="preserve">17 </w:t>
+            </w:r>
+            <w:proofErr w:type="spellStart"/>
+            <w:r>
+              <w:rPr>
+                <w:b/>
+                <w:bCs/>
+              </w:rPr>
+              <w:t>ptsAlmost</w:t>
+            </w:r>
+            <w:proofErr w:type="spellEnd"/>
+            <w:r>
+              <w:rPr>
+                <w:b/>
+                <w:bCs/>
+              </w:rPr>
+              <w:t xml:space="preserve"> </w:t>
+            </w:r>
+            <w:proofErr w:type="spellStart"/>
+            <w:r>
+              <w:rPr>
+                <w:b/>
+                <w:bCs/>
+              </w:rPr>
+              <w:t>There</w:t>
+            </w:r>
+            <w:r>
+              <w:t>Methods</w:t>
+            </w:r>
+            <w:proofErr w:type="spellEnd"/>
+            <w:r>
+              <w:t xml:space="preserve"> and criteria are generally appropriate, but their rationale, specificity, or connection to research needs development.</w:t>
             </w:r>
           </w:p>
           <w:p>
@@ -430,10 +431,38 @@
                 <w:b/>
                 <w:bCs/>
               </w:rPr>
-              <w:t>16 ptsNeeds Work</w:t>
-            </w:r>
-            <w:r>
-              <w:t>Methods or criteria are vague, insufficiently justified, poorly matched to the document, or difficult to apply.</w:t>
+              <w:t xml:space="preserve">16 </w:t>
+            </w:r>
+            <w:proofErr w:type="spellStart"/>
+            <w:r>
+              <w:rPr>
+                <w:b/>
+                <w:bCs/>
+              </w:rPr>
+              <w:t>ptsNeeds</w:t>
+            </w:r>
+            <w:proofErr w:type="spellEnd"/>
+            <w:r>
+              <w:rPr>
+                <w:b/>
+                <w:bCs/>
+              </w:rPr>
+              <w:t xml:space="preserve"> </w:t>
+            </w:r>
+            <w:proofErr w:type="spellStart"/>
+            <w:r>
+              <w:rPr>
+                <w:b/>
+                <w:bCs/>
+              </w:rPr>
+              <w:t>Work</w:t>
+            </w:r>
+            <w:r>
+              <w:t>Methods</w:t>
+            </w:r>
+            <w:proofErr w:type="spellEnd"/>
+            <w:r>
+              <w:t xml:space="preserve"> or criteria are vague, insufficiently justified, poorly matched to the document, or difficult to apply.</w:t>
             </w:r>
           </w:p>
           <w:p>
@@ -448,46 +477,45 @@
                 <w:b/>
                 <w:bCs/>
               </w:rPr>
-              <w:t>0 ptsNot Met</w:t>
-            </w:r>
-            <w:r>
-              <w:t>Report has not met minimum requirements; evaluate only The Basics.</w:t>
-            </w:r>
-          </w:p>
-        </w:tc>
-        <w:tc>
-          <w:tcPr>
-            <w:tcW w:w="0" w:type="auto"/>
-            <w:tcBorders>
-              <w:top w:val="single" w:sz="6" w:space="0" w:color="E8EAEC"/>
-              <w:left w:val="single" w:sz="6" w:space="0" w:color="E8EAEC"/>
-              <w:bottom w:val="single" w:sz="6" w:space="0" w:color="E8EAEC"/>
-              <w:right w:val="single" w:sz="6" w:space="0" w:color="E8EAEC"/>
-            </w:tcBorders>
-            <w:shd w:val="clear" w:color="auto" w:fill="FFFFFF"/>
-            <w:noWrap/>
-            <w:tcMar>
-              <w:top w:w="105" w:type="dxa"/>
-              <w:left w:w="150" w:type="dxa"/>
-              <w:bottom w:w="105" w:type="dxa"/>
-              <w:right w:w="150" w:type="dxa"/>
-            </w:tcMar>
-            <w:vAlign w:val="center"/>
-            <w:hideMark/>
-          </w:tcPr>
-          <w:p>
-            <w:r>
-              <w:t>20 pts</w:t>
-            </w:r>
-            <w:r>
-              <w:br/>
+              <w:t xml:space="preserve">0 </w:t>
+            </w:r>
+            <w:proofErr w:type="spellStart"/>
+            <w:r>
+              <w:rPr>
+                <w:b/>
+                <w:bCs/>
+              </w:rPr>
+              <w:t>ptsNot</w:t>
+            </w:r>
+            <w:proofErr w:type="spellEnd"/>
+            <w:r>
+              <w:rPr>
+                <w:b/>
+                <w:bCs/>
+              </w:rPr>
+              <w:t xml:space="preserve"> </w:t>
+            </w:r>
+            <w:proofErr w:type="spellStart"/>
+            <w:r>
+              <w:rPr>
+                <w:b/>
+                <w:bCs/>
+              </w:rPr>
+              <w:t>Met</w:t>
+            </w:r>
+            <w:r>
+              <w:t>Report</w:t>
+            </w:r>
+            <w:proofErr w:type="spellEnd"/>
+            <w:r>
+              <w:t xml:space="preserve"> has not met minimum requirements; evaluate only The Basics.</w:t>
             </w:r>
           </w:p>
         </w:tc>
       </w:tr>
       <w:tr>
         <w:trPr>
-          <w:trHeight w:val="5625"/>
+          <w:trHeight w:val="20"/>
         </w:trPr>
         <w:tc>
           <w:tcPr>
@@ -509,7 +537,7 @@
           </w:tcPr>
           <w:p>
             <w:r>
-              <w:t>This criterion is linked to a Learning OutcomeFindings, Analysis &amp; Conclusions</w:t>
+              <w:t>Findings, Analysis &amp; Conclusions</w:t>
             </w:r>
           </w:p>
           <w:p>
@@ -520,7 +548,7 @@
         </w:tc>
         <w:tc>
           <w:tcPr>
-            <w:tcW w:w="0" w:type="auto"/>
+            <w:tcW w:w="13257" w:type="dxa"/>
             <w:tcBorders>
               <w:top w:val="single" w:sz="6" w:space="0" w:color="E8EAEC"/>
               <w:left w:val="single" w:sz="6" w:space="0" w:color="E8EAEC"/>
@@ -534,7 +562,6 @@
               <w:bottom w:w="0" w:type="dxa"/>
               <w:right w:w="0" w:type="dxa"/>
             </w:tcMar>
-            <w:vAlign w:val="center"/>
             <w:hideMark/>
           </w:tcPr>
           <w:p>
@@ -549,10 +576,38 @@
                 <w:b/>
                 <w:bCs/>
               </w:rPr>
-              <w:t>20 ptsMeets or Exceeds</w:t>
-            </w:r>
-            <w:r>
-              <w:t>Identifies significant issues in document design and organization, usability, plain language, and accessibility as relevant. Supports findings with specific document examples and research-based criteria; conclusions explain effects on users and client goals.</w:t>
+              <w:t xml:space="preserve">25 </w:t>
+            </w:r>
+            <w:proofErr w:type="spellStart"/>
+            <w:r>
+              <w:rPr>
+                <w:b/>
+                <w:bCs/>
+              </w:rPr>
+              <w:t>ptsMeets</w:t>
+            </w:r>
+            <w:proofErr w:type="spellEnd"/>
+            <w:r>
+              <w:rPr>
+                <w:b/>
+                <w:bCs/>
+              </w:rPr>
+              <w:t xml:space="preserve"> or </w:t>
+            </w:r>
+            <w:proofErr w:type="spellStart"/>
+            <w:r>
+              <w:rPr>
+                <w:b/>
+                <w:bCs/>
+              </w:rPr>
+              <w:t>Exceeds</w:t>
+            </w:r>
+            <w:r>
+              <w:t>Identifies</w:t>
+            </w:r>
+            <w:proofErr w:type="spellEnd"/>
+            <w:r>
+              <w:t xml:space="preserve"> significant issues in document design and organization, usability, plain language, and accessibility as relevant. Supports findings with specific document examples and research-based criteria; conclusions explain effects on users and client goals.</w:t>
             </w:r>
           </w:p>
           <w:p>
@@ -567,10 +622,38 @@
                 <w:b/>
                 <w:bCs/>
               </w:rPr>
-              <w:t>17 ptsAlmost There</w:t>
-            </w:r>
-            <w:r>
-              <w:t>Findings and conclusions are generally supported, but some examples, evaluation, implications, or connections to criteria need development.</w:t>
+              <w:t xml:space="preserve">22 </w:t>
+            </w:r>
+            <w:proofErr w:type="spellStart"/>
+            <w:r>
+              <w:rPr>
+                <w:b/>
+                <w:bCs/>
+              </w:rPr>
+              <w:t>ptsAlmost</w:t>
+            </w:r>
+            <w:proofErr w:type="spellEnd"/>
+            <w:r>
+              <w:rPr>
+                <w:b/>
+                <w:bCs/>
+              </w:rPr>
+              <w:t xml:space="preserve"> </w:t>
+            </w:r>
+            <w:proofErr w:type="spellStart"/>
+            <w:r>
+              <w:rPr>
+                <w:b/>
+                <w:bCs/>
+              </w:rPr>
+              <w:t>There</w:t>
+            </w:r>
+            <w:r>
+              <w:t>Findings</w:t>
+            </w:r>
+            <w:proofErr w:type="spellEnd"/>
+            <w:r>
+              <w:t xml:space="preserve"> and conclusions are generally supported, but some examples, evaluation, implications, or connections to criteria need development.</w:t>
             </w:r>
           </w:p>
           <w:p>
@@ -585,10 +668,38 @@
                 <w:b/>
                 <w:bCs/>
               </w:rPr>
-              <w:t>16 ptsNeeds Work</w:t>
-            </w:r>
-            <w:r>
-              <w:t>Findings are mostly general or descriptive, insufficiently supported, or weakly connected to reader needs and conclusions.</w:t>
+              <w:t xml:space="preserve">20 </w:t>
+            </w:r>
+            <w:proofErr w:type="spellStart"/>
+            <w:r>
+              <w:rPr>
+                <w:b/>
+                <w:bCs/>
+              </w:rPr>
+              <w:t>ptsNeeds</w:t>
+            </w:r>
+            <w:proofErr w:type="spellEnd"/>
+            <w:r>
+              <w:rPr>
+                <w:b/>
+                <w:bCs/>
+              </w:rPr>
+              <w:t xml:space="preserve"> </w:t>
+            </w:r>
+            <w:proofErr w:type="spellStart"/>
+            <w:r>
+              <w:rPr>
+                <w:b/>
+                <w:bCs/>
+              </w:rPr>
+              <w:t>Work</w:t>
+            </w:r>
+            <w:r>
+              <w:t>Findings</w:t>
+            </w:r>
+            <w:proofErr w:type="spellEnd"/>
+            <w:r>
+              <w:t xml:space="preserve"> are mostly general or descriptive, insufficiently supported, or weakly connected to reader needs and conclusions.</w:t>
             </w:r>
           </w:p>
           <w:p>
@@ -603,46 +714,46 @@
                 <w:b/>
                 <w:bCs/>
               </w:rPr>
-              <w:t>0 ptsNot Met</w:t>
-            </w:r>
-            <w:r>
-              <w:t>Report has not met minimum requirements; evaluate only The Basics.</w:t>
-            </w:r>
-          </w:p>
-        </w:tc>
-        <w:tc>
-          <w:tcPr>
-            <w:tcW w:w="0" w:type="auto"/>
-            <w:tcBorders>
-              <w:top w:val="single" w:sz="6" w:space="0" w:color="E8EAEC"/>
-              <w:left w:val="single" w:sz="6" w:space="0" w:color="E8EAEC"/>
-              <w:bottom w:val="single" w:sz="6" w:space="0" w:color="E8EAEC"/>
-              <w:right w:val="single" w:sz="6" w:space="0" w:color="E8EAEC"/>
-            </w:tcBorders>
-            <w:shd w:val="clear" w:color="auto" w:fill="FFFFFF"/>
-            <w:noWrap/>
-            <w:tcMar>
-              <w:top w:w="105" w:type="dxa"/>
-              <w:left w:w="150" w:type="dxa"/>
-              <w:bottom w:w="105" w:type="dxa"/>
-              <w:right w:w="150" w:type="dxa"/>
-            </w:tcMar>
-            <w:vAlign w:val="center"/>
-            <w:hideMark/>
-          </w:tcPr>
-          <w:p>
-            <w:r>
-              <w:t>20 pts</w:t>
-            </w:r>
-            <w:r>
-              <w:br/>
+              <w:lastRenderedPageBreak/>
+              <w:t xml:space="preserve">0 </w:t>
+            </w:r>
+            <w:proofErr w:type="spellStart"/>
+            <w:r>
+              <w:rPr>
+                <w:b/>
+                <w:bCs/>
+              </w:rPr>
+              <w:t>ptsNot</w:t>
+            </w:r>
+            <w:proofErr w:type="spellEnd"/>
+            <w:r>
+              <w:rPr>
+                <w:b/>
+                <w:bCs/>
+              </w:rPr>
+              <w:t xml:space="preserve"> </w:t>
+            </w:r>
+            <w:proofErr w:type="spellStart"/>
+            <w:r>
+              <w:rPr>
+                <w:b/>
+                <w:bCs/>
+              </w:rPr>
+              <w:t>Met</w:t>
+            </w:r>
+            <w:r>
+              <w:t>Report</w:t>
+            </w:r>
+            <w:proofErr w:type="spellEnd"/>
+            <w:r>
+              <w:t xml:space="preserve"> has not met minimum requirements; evaluate only The Basics.</w:t>
             </w:r>
           </w:p>
         </w:tc>
       </w:tr>
       <w:tr>
         <w:trPr>
-          <w:trHeight w:val="5320"/>
+          <w:trHeight w:val="20"/>
         </w:trPr>
         <w:tc>
           <w:tcPr>
@@ -665,18 +776,18 @@
           <w:p>
             <w:r>
               <w:lastRenderedPageBreak/>
-              <w:t>This criterion is linked to a Learning OutcomeDecision Matrix &amp; Comparison of Solutions</w:t>
-            </w:r>
-          </w:p>
-          <w:p>
-            <w:r>
-              <w:t>Uses a decision matrix to compare feasible improvements using transparent, relevant criteria.</w:t>
+              <w:t>Recommendations &amp; Practicality</w:t>
+            </w:r>
+          </w:p>
+          <w:p>
+            <w:r>
+              <w:t>Proposes specific, feasible communication improvements justified by findings and credible evidence.</w:t>
             </w:r>
           </w:p>
         </w:tc>
         <w:tc>
           <w:tcPr>
-            <w:tcW w:w="0" w:type="auto"/>
+            <w:tcW w:w="13257" w:type="dxa"/>
             <w:tcBorders>
               <w:top w:val="single" w:sz="6" w:space="0" w:color="E8EAEC"/>
               <w:left w:val="single" w:sz="6" w:space="0" w:color="E8EAEC"/>
@@ -690,7 +801,6 @@
               <w:bottom w:w="0" w:type="dxa"/>
               <w:right w:w="0" w:type="dxa"/>
             </w:tcMar>
-            <w:vAlign w:val="center"/>
             <w:hideMark/>
           </w:tcPr>
           <w:p>
@@ -705,10 +815,38 @@
                 <w:b/>
                 <w:bCs/>
               </w:rPr>
-              <w:t>15 ptsMeets or Exceeds</w:t>
-            </w:r>
-            <w:r>
-              <w:t>Matrix clearly identifies realistic alternatives and relevant criteria, applies them consistently, and makes the basis for comparing tradeoffs understandable. Discussion interprets the matrix rather than merely repeating its entries.</w:t>
+              <w:t xml:space="preserve">30 </w:t>
+            </w:r>
+            <w:proofErr w:type="spellStart"/>
+            <w:r>
+              <w:rPr>
+                <w:b/>
+                <w:bCs/>
+              </w:rPr>
+              <w:t>ptsMeets</w:t>
+            </w:r>
+            <w:proofErr w:type="spellEnd"/>
+            <w:r>
+              <w:rPr>
+                <w:b/>
+                <w:bCs/>
+              </w:rPr>
+              <w:t xml:space="preserve"> or </w:t>
+            </w:r>
+            <w:proofErr w:type="spellStart"/>
+            <w:r>
+              <w:rPr>
+                <w:b/>
+                <w:bCs/>
+              </w:rPr>
+              <w:t>Exceeds</w:t>
+            </w:r>
+            <w:r>
+              <w:t>Recommendations</w:t>
+            </w:r>
+            <w:proofErr w:type="spellEnd"/>
+            <w:r>
+              <w:t xml:space="preserve"> are specific, actionable, and clearly tied to findings and credible evidence. Explains expected benefits, relevant priorities, and practical implementation considerations for the client; focuses on communication rather than replacing subject-matter expertise.</w:t>
             </w:r>
           </w:p>
           <w:p>
@@ -723,10 +861,38 @@
                 <w:b/>
                 <w:bCs/>
               </w:rPr>
-              <w:t>13 ptsAlmost There</w:t>
-            </w:r>
-            <w:r>
-              <w:t>Matrix and comparison are useful, but criteria, scoring rationale, tradeoffs, or interpretation need clarification.</w:t>
+              <w:t xml:space="preserve">25 </w:t>
+            </w:r>
+            <w:proofErr w:type="spellStart"/>
+            <w:r>
+              <w:rPr>
+                <w:b/>
+                <w:bCs/>
+              </w:rPr>
+              <w:t>ptsAlmost</w:t>
+            </w:r>
+            <w:proofErr w:type="spellEnd"/>
+            <w:r>
+              <w:rPr>
+                <w:b/>
+                <w:bCs/>
+              </w:rPr>
+              <w:t xml:space="preserve"> </w:t>
+            </w:r>
+            <w:proofErr w:type="spellStart"/>
+            <w:r>
+              <w:rPr>
+                <w:b/>
+                <w:bCs/>
+              </w:rPr>
+              <w:t>There</w:t>
+            </w:r>
+            <w:r>
+              <w:t>Recommendations</w:t>
+            </w:r>
+            <w:proofErr w:type="spellEnd"/>
+            <w:r>
+              <w:t xml:space="preserve"> are relevant and generally feasible, but some lack specificity, evidence, explanation of benefits, or discussion of implementation.</w:t>
             </w:r>
           </w:p>
           <w:p>
@@ -741,10 +907,38 @@
                 <w:b/>
                 <w:bCs/>
               </w:rPr>
-              <w:t>12 ptsNeeds Work</w:t>
-            </w:r>
-            <w:r>
-              <w:t>Matrix or comparison is difficult to interpret, weakly justified, inconsistent, or disconnected from the proposed improvements.</w:t>
+              <w:t xml:space="preserve">23 </w:t>
+            </w:r>
+            <w:proofErr w:type="spellStart"/>
+            <w:r>
+              <w:rPr>
+                <w:b/>
+                <w:bCs/>
+              </w:rPr>
+              <w:t>ptsNeeds</w:t>
+            </w:r>
+            <w:proofErr w:type="spellEnd"/>
+            <w:r>
+              <w:rPr>
+                <w:b/>
+                <w:bCs/>
+              </w:rPr>
+              <w:t xml:space="preserve"> </w:t>
+            </w:r>
+            <w:proofErr w:type="spellStart"/>
+            <w:r>
+              <w:rPr>
+                <w:b/>
+                <w:bCs/>
+              </w:rPr>
+              <w:t>Work</w:t>
+            </w:r>
+            <w:r>
+              <w:t>Recommendations</w:t>
+            </w:r>
+            <w:proofErr w:type="spellEnd"/>
+            <w:r>
+              <w:t xml:space="preserve"> are vague, unsupported, impractical, or not clearly derived from the analysis.</w:t>
             </w:r>
           </w:p>
           <w:p>
@@ -759,46 +953,45 @@
                 <w:b/>
                 <w:bCs/>
               </w:rPr>
-              <w:t>0 ptsNot Met</w:t>
-            </w:r>
-            <w:r>
-              <w:t>Report has not met minimum requirements; evaluate only The Basics.</w:t>
-            </w:r>
-          </w:p>
-        </w:tc>
-        <w:tc>
-          <w:tcPr>
-            <w:tcW w:w="0" w:type="auto"/>
-            <w:tcBorders>
-              <w:top w:val="single" w:sz="6" w:space="0" w:color="E8EAEC"/>
-              <w:left w:val="single" w:sz="6" w:space="0" w:color="E8EAEC"/>
-              <w:bottom w:val="single" w:sz="6" w:space="0" w:color="E8EAEC"/>
-              <w:right w:val="single" w:sz="6" w:space="0" w:color="E8EAEC"/>
-            </w:tcBorders>
-            <w:shd w:val="clear" w:color="auto" w:fill="FFFFFF"/>
-            <w:noWrap/>
-            <w:tcMar>
-              <w:top w:w="105" w:type="dxa"/>
-              <w:left w:w="150" w:type="dxa"/>
-              <w:bottom w:w="105" w:type="dxa"/>
-              <w:right w:w="150" w:type="dxa"/>
-            </w:tcMar>
-            <w:vAlign w:val="center"/>
-            <w:hideMark/>
-          </w:tcPr>
-          <w:p>
-            <w:r>
-              <w:t>15 pts</w:t>
-            </w:r>
-            <w:r>
-              <w:br/>
+              <w:t xml:space="preserve">0 </w:t>
+            </w:r>
+            <w:proofErr w:type="spellStart"/>
+            <w:r>
+              <w:rPr>
+                <w:b/>
+                <w:bCs/>
+              </w:rPr>
+              <w:t>ptsNot</w:t>
+            </w:r>
+            <w:proofErr w:type="spellEnd"/>
+            <w:r>
+              <w:rPr>
+                <w:b/>
+                <w:bCs/>
+              </w:rPr>
+              <w:t xml:space="preserve"> </w:t>
+            </w:r>
+            <w:proofErr w:type="spellStart"/>
+            <w:r>
+              <w:rPr>
+                <w:b/>
+                <w:bCs/>
+              </w:rPr>
+              <w:t>Met</w:t>
+            </w:r>
+            <w:r>
+              <w:t>Report</w:t>
+            </w:r>
+            <w:proofErr w:type="spellEnd"/>
+            <w:r>
+              <w:t xml:space="preserve"> has not met minimum requirements; evaluate only The Basics.</w:t>
             </w:r>
           </w:p>
         </w:tc>
       </w:tr>
       <w:tr>
         <w:trPr>
-          <w:trHeight w:val="5625"/>
+          <w:trHeight w:val="20"/>
         </w:trPr>
         <w:tc>
           <w:tcPr>
@@ -820,19 +1013,26 @@
           </w:tcPr>
           <w:p>
             <w:r>
-              <w:lastRenderedPageBreak/>
-              <w:t>This criterion is linked to a Learning OutcomeRecommendations &amp; Practicality</w:t>
-            </w:r>
-          </w:p>
-          <w:p>
-            <w:r>
-              <w:t>Proposes specific, prioritized communication improvements justified by findings and feasibility.</w:t>
+              <w:t>Audience, Purpose &amp; Report Sections</w:t>
+            </w:r>
+          </w:p>
+          <w:p>
+            <w:r>
+              <w:t xml:space="preserve">Adapts the report to the client key contact and uses the required </w:t>
+            </w:r>
+            <w:proofErr w:type="gramStart"/>
+            <w:r>
+              <w:t>recommendation-report</w:t>
+            </w:r>
+            <w:proofErr w:type="gramEnd"/>
+            <w:r>
+              <w:t xml:space="preserve"> structure effectively.</w:t>
             </w:r>
           </w:p>
         </w:tc>
         <w:tc>
           <w:tcPr>
-            <w:tcW w:w="0" w:type="auto"/>
+            <w:tcW w:w="13257" w:type="dxa"/>
             <w:tcBorders>
               <w:top w:val="single" w:sz="6" w:space="0" w:color="E8EAEC"/>
               <w:left w:val="single" w:sz="6" w:space="0" w:color="E8EAEC"/>
@@ -846,7 +1046,6 @@
               <w:bottom w:w="0" w:type="dxa"/>
               <w:right w:w="0" w:type="dxa"/>
             </w:tcMar>
-            <w:vAlign w:val="center"/>
             <w:hideMark/>
           </w:tcPr>
           <w:p>
@@ -861,10 +1060,38 @@
                 <w:b/>
                 <w:bCs/>
               </w:rPr>
-              <w:t>20 ptsMeets or Exceeds</w:t>
-            </w:r>
-            <w:r>
-              <w:t>Recommendations are specific, actionable, and clearly tied to findings and credible evidence. Explains priority, expected benefits, and practical considerations or tradeoffs for the client; focuses on communication rather than replacing subject-matter expertise.</w:t>
+              <w:t xml:space="preserve">10 </w:t>
+            </w:r>
+            <w:proofErr w:type="spellStart"/>
+            <w:r>
+              <w:rPr>
+                <w:b/>
+                <w:bCs/>
+              </w:rPr>
+              <w:t>ptsMeets</w:t>
+            </w:r>
+            <w:proofErr w:type="spellEnd"/>
+            <w:r>
+              <w:rPr>
+                <w:b/>
+                <w:bCs/>
+              </w:rPr>
+              <w:t xml:space="preserve"> or </w:t>
+            </w:r>
+            <w:proofErr w:type="spellStart"/>
+            <w:r>
+              <w:rPr>
+                <w:b/>
+                <w:bCs/>
+              </w:rPr>
+              <w:t>Exceeds</w:t>
+            </w:r>
+            <w:r>
+              <w:t>Consistently</w:t>
+            </w:r>
+            <w:proofErr w:type="spellEnd"/>
+            <w:r>
+              <w:t xml:space="preserve"> addresses the client key contact as decision maker while considering the client document’s users. Front matter, body, and back matter perform their distinct functions; abstract and executive summary effectively convey the study and recommendations.</w:t>
             </w:r>
           </w:p>
           <w:p>
@@ -879,10 +1106,46 @@
                 <w:b/>
                 <w:bCs/>
               </w:rPr>
-              <w:t>17 ptsAlmost There</w:t>
-            </w:r>
-            <w:r>
-              <w:t>Recommendations are relevant and generally feasible, but some lack specificity, prioritization, evidence, or discussion of implementation.</w:t>
+              <w:t xml:space="preserve">9 </w:t>
+            </w:r>
+            <w:proofErr w:type="spellStart"/>
+            <w:r>
+              <w:rPr>
+                <w:b/>
+                <w:bCs/>
+              </w:rPr>
+              <w:t>ptsAlmost</w:t>
+            </w:r>
+            <w:proofErr w:type="spellEnd"/>
+            <w:r>
+              <w:rPr>
+                <w:b/>
+                <w:bCs/>
+              </w:rPr>
+              <w:t xml:space="preserve"> </w:t>
+            </w:r>
+            <w:proofErr w:type="spellStart"/>
+            <w:r>
+              <w:rPr>
+                <w:b/>
+                <w:bCs/>
+              </w:rPr>
+              <w:t>There</w:t>
+            </w:r>
+            <w:r>
+              <w:t>Audience</w:t>
+            </w:r>
+            <w:proofErr w:type="spellEnd"/>
+            <w:r>
+              <w:t xml:space="preserve"> adaptation and report sections are generally effective, but some content is misplaced, repetitive, underdeveloped, or insufficiently </w:t>
+            </w:r>
+            <w:proofErr w:type="gramStart"/>
+            <w:r>
+              <w:t>reader-centered</w:t>
+            </w:r>
+            <w:proofErr w:type="gramEnd"/>
+            <w:r>
+              <w:t>.</w:t>
             </w:r>
           </w:p>
           <w:p>
@@ -897,10 +1160,38 @@
                 <w:b/>
                 <w:bCs/>
               </w:rPr>
-              <w:t>15 ptsNeeds Work</w:t>
-            </w:r>
-            <w:r>
-              <w:t>Recommendations are vague, unsupported, impractical, insufficiently prioritized, or not clearly derived from the analysis.</w:t>
+              <w:t xml:space="preserve">8 </w:t>
+            </w:r>
+            <w:proofErr w:type="spellStart"/>
+            <w:r>
+              <w:rPr>
+                <w:b/>
+                <w:bCs/>
+              </w:rPr>
+              <w:t>ptsNeeds</w:t>
+            </w:r>
+            <w:proofErr w:type="spellEnd"/>
+            <w:r>
+              <w:rPr>
+                <w:b/>
+                <w:bCs/>
+              </w:rPr>
+              <w:t xml:space="preserve"> </w:t>
+            </w:r>
+            <w:proofErr w:type="spellStart"/>
+            <w:r>
+              <w:rPr>
+                <w:b/>
+                <w:bCs/>
+              </w:rPr>
+              <w:t>Work</w:t>
+            </w:r>
+            <w:r>
+              <w:t>Report</w:t>
+            </w:r>
+            <w:proofErr w:type="spellEnd"/>
+            <w:r>
+              <w:t xml:space="preserve"> does not consistently address the client’s decision needs, or required sections are weakly developed or poorly organized.</w:t>
             </w:r>
           </w:p>
           <w:p>
@@ -915,46 +1206,45 @@
                 <w:b/>
                 <w:bCs/>
               </w:rPr>
-              <w:t>0 ptsNot Met</w:t>
-            </w:r>
-            <w:r>
-              <w:t>Report has not met minimum requirements; evaluate only The Basics.</w:t>
-            </w:r>
-          </w:p>
-        </w:tc>
-        <w:tc>
-          <w:tcPr>
-            <w:tcW w:w="0" w:type="auto"/>
-            <w:tcBorders>
-              <w:top w:val="single" w:sz="6" w:space="0" w:color="E8EAEC"/>
-              <w:left w:val="single" w:sz="6" w:space="0" w:color="E8EAEC"/>
-              <w:bottom w:val="single" w:sz="6" w:space="0" w:color="E8EAEC"/>
-              <w:right w:val="single" w:sz="6" w:space="0" w:color="E8EAEC"/>
-            </w:tcBorders>
-            <w:shd w:val="clear" w:color="auto" w:fill="FFFFFF"/>
-            <w:noWrap/>
-            <w:tcMar>
-              <w:top w:w="105" w:type="dxa"/>
-              <w:left w:w="150" w:type="dxa"/>
-              <w:bottom w:w="105" w:type="dxa"/>
-              <w:right w:w="150" w:type="dxa"/>
-            </w:tcMar>
-            <w:vAlign w:val="center"/>
-            <w:hideMark/>
-          </w:tcPr>
-          <w:p>
-            <w:r>
-              <w:t>20 pts</w:t>
-            </w:r>
-            <w:r>
-              <w:br/>
+              <w:t xml:space="preserve">0 </w:t>
+            </w:r>
+            <w:proofErr w:type="spellStart"/>
+            <w:r>
+              <w:rPr>
+                <w:b/>
+                <w:bCs/>
+              </w:rPr>
+              <w:t>ptsNot</w:t>
+            </w:r>
+            <w:proofErr w:type="spellEnd"/>
+            <w:r>
+              <w:rPr>
+                <w:b/>
+                <w:bCs/>
+              </w:rPr>
+              <w:t xml:space="preserve"> </w:t>
+            </w:r>
+            <w:proofErr w:type="spellStart"/>
+            <w:r>
+              <w:rPr>
+                <w:b/>
+                <w:bCs/>
+              </w:rPr>
+              <w:t>Met</w:t>
+            </w:r>
+            <w:r>
+              <w:t>Report</w:t>
+            </w:r>
+            <w:proofErr w:type="spellEnd"/>
+            <w:r>
+              <w:t xml:space="preserve"> has not met minimum requirements; evaluate only The Basics.</w:t>
             </w:r>
           </w:p>
         </w:tc>
       </w:tr>
       <w:tr>
         <w:trPr>
-          <w:trHeight w:val="5625"/>
+          <w:trHeight w:val="20"/>
         </w:trPr>
         <w:tc>
           <w:tcPr>
@@ -976,19 +1266,18 @@
           </w:tcPr>
           <w:p>
             <w:r>
-              <w:lastRenderedPageBreak/>
-              <w:t>This criterion is linked to a Learning OutcomeAudience, Purpose &amp; Report Sections</w:t>
-            </w:r>
-          </w:p>
-          <w:p>
-            <w:r>
-              <w:t>Adapts the report to the client key contact and uses the required recommendation-report structure effectively.</w:t>
+              <w:t>Visual Evidence &amp; Integration</w:t>
+            </w:r>
+          </w:p>
+          <w:p>
+            <w:r>
+              <w:t>Uses at least three purposeful visuals to clarify evidence and recommendations.</w:t>
             </w:r>
           </w:p>
         </w:tc>
         <w:tc>
           <w:tcPr>
-            <w:tcW w:w="0" w:type="auto"/>
+            <w:tcW w:w="13257" w:type="dxa"/>
             <w:tcBorders>
               <w:top w:val="single" w:sz="6" w:space="0" w:color="E8EAEC"/>
               <w:left w:val="single" w:sz="6" w:space="0" w:color="E8EAEC"/>
@@ -1002,7 +1291,6 @@
               <w:bottom w:w="0" w:type="dxa"/>
               <w:right w:w="0" w:type="dxa"/>
             </w:tcMar>
-            <w:vAlign w:val="center"/>
             <w:hideMark/>
           </w:tcPr>
           <w:p>
@@ -1017,10 +1305,38 @@
                 <w:b/>
                 <w:bCs/>
               </w:rPr>
-              <w:t>10 ptsMeets or Exceeds</w:t>
-            </w:r>
-            <w:r>
-              <w:t>Consistently addresses the client key contact as decision maker while considering the client document’s users. Front matter, body, and back matter perform their distinct functions; abstract and executive summary effectively convey the study and recommendations.</w:t>
+              <w:t xml:space="preserve">5 </w:t>
+            </w:r>
+            <w:proofErr w:type="spellStart"/>
+            <w:r>
+              <w:rPr>
+                <w:b/>
+                <w:bCs/>
+              </w:rPr>
+              <w:t>ptsMeets</w:t>
+            </w:r>
+            <w:proofErr w:type="spellEnd"/>
+            <w:r>
+              <w:rPr>
+                <w:b/>
+                <w:bCs/>
+              </w:rPr>
+              <w:t xml:space="preserve"> or </w:t>
+            </w:r>
+            <w:proofErr w:type="spellStart"/>
+            <w:r>
+              <w:rPr>
+                <w:b/>
+                <w:bCs/>
+              </w:rPr>
+              <w:t>Exceeds</w:t>
+            </w:r>
+            <w:r>
+              <w:t>Visuals</w:t>
+            </w:r>
+            <w:proofErr w:type="spellEnd"/>
+            <w:r>
+              <w:t xml:space="preserve"> are relevant, legible, accessible, and helpful; each is numbered, descriptively captioned, cited in the preceding text, and placed alongside or after its first reference. Examples make document problems or solutions concrete.</w:t>
             </w:r>
           </w:p>
           <w:p>
@@ -1035,10 +1351,38 @@
                 <w:b/>
                 <w:bCs/>
               </w:rPr>
-              <w:t>9 ptsAlmost There</w:t>
-            </w:r>
-            <w:r>
-              <w:t>Audience adaptation and report sections are generally effective, but some content is misplaced, repetitive, underdeveloped, or insufficiently reader-centered.</w:t>
+              <w:t xml:space="preserve">4 </w:t>
+            </w:r>
+            <w:proofErr w:type="spellStart"/>
+            <w:r>
+              <w:rPr>
+                <w:b/>
+                <w:bCs/>
+              </w:rPr>
+              <w:t>ptsAlmost</w:t>
+            </w:r>
+            <w:proofErr w:type="spellEnd"/>
+            <w:r>
+              <w:rPr>
+                <w:b/>
+                <w:bCs/>
+              </w:rPr>
+              <w:t xml:space="preserve"> </w:t>
+            </w:r>
+            <w:proofErr w:type="spellStart"/>
+            <w:r>
+              <w:rPr>
+                <w:b/>
+                <w:bCs/>
+              </w:rPr>
+              <w:t>There</w:t>
+            </w:r>
+            <w:r>
+              <w:t>Visuals</w:t>
+            </w:r>
+            <w:proofErr w:type="spellEnd"/>
+            <w:r>
+              <w:t xml:space="preserve"> generally help readers, but some labels, captions, placement, references, legibility, or interpretation need improvement.</w:t>
             </w:r>
           </w:p>
           <w:p>
@@ -1053,10 +1397,39 @@
                 <w:b/>
                 <w:bCs/>
               </w:rPr>
-              <w:t>8 ptsNeeds Work</w:t>
-            </w:r>
-            <w:r>
-              <w:t>Report does not consistently address the client’s decision needs, or required sections are weakly developed or poorly organized.</w:t>
+              <w:lastRenderedPageBreak/>
+              <w:t xml:space="preserve">3 </w:t>
+            </w:r>
+            <w:proofErr w:type="spellStart"/>
+            <w:r>
+              <w:rPr>
+                <w:b/>
+                <w:bCs/>
+              </w:rPr>
+              <w:t>ptsNeeds</w:t>
+            </w:r>
+            <w:proofErr w:type="spellEnd"/>
+            <w:r>
+              <w:rPr>
+                <w:b/>
+                <w:bCs/>
+              </w:rPr>
+              <w:t xml:space="preserve"> </w:t>
+            </w:r>
+            <w:proofErr w:type="spellStart"/>
+            <w:r>
+              <w:rPr>
+                <w:b/>
+                <w:bCs/>
+              </w:rPr>
+              <w:t>Work</w:t>
+            </w:r>
+            <w:r>
+              <w:t>Visuals</w:t>
+            </w:r>
+            <w:proofErr w:type="spellEnd"/>
+            <w:r>
+              <w:t xml:space="preserve"> are confusing, poorly integrated, insufficiently explained, or do little to clarify the report.</w:t>
             </w:r>
           </w:p>
           <w:p>
@@ -1071,46 +1444,45 @@
                 <w:b/>
                 <w:bCs/>
               </w:rPr>
-              <w:t>0 ptsNot Met</w:t>
-            </w:r>
-            <w:r>
-              <w:t>Report has not met minimum requirements; evaluate only The Basics.</w:t>
-            </w:r>
-          </w:p>
-        </w:tc>
-        <w:tc>
-          <w:tcPr>
-            <w:tcW w:w="0" w:type="auto"/>
-            <w:tcBorders>
-              <w:top w:val="single" w:sz="6" w:space="0" w:color="E8EAEC"/>
-              <w:left w:val="single" w:sz="6" w:space="0" w:color="E8EAEC"/>
-              <w:bottom w:val="single" w:sz="6" w:space="0" w:color="E8EAEC"/>
-              <w:right w:val="single" w:sz="6" w:space="0" w:color="E8EAEC"/>
-            </w:tcBorders>
-            <w:shd w:val="clear" w:color="auto" w:fill="FFFFFF"/>
-            <w:noWrap/>
-            <w:tcMar>
-              <w:top w:w="105" w:type="dxa"/>
-              <w:left w:w="150" w:type="dxa"/>
-              <w:bottom w:w="105" w:type="dxa"/>
-              <w:right w:w="150" w:type="dxa"/>
-            </w:tcMar>
-            <w:vAlign w:val="center"/>
-            <w:hideMark/>
-          </w:tcPr>
-          <w:p>
-            <w:r>
-              <w:t>10 pts</w:t>
-            </w:r>
-            <w:r>
-              <w:br/>
+              <w:t xml:space="preserve">0 </w:t>
+            </w:r>
+            <w:proofErr w:type="spellStart"/>
+            <w:r>
+              <w:rPr>
+                <w:b/>
+                <w:bCs/>
+              </w:rPr>
+              <w:t>ptsNot</w:t>
+            </w:r>
+            <w:proofErr w:type="spellEnd"/>
+            <w:r>
+              <w:rPr>
+                <w:b/>
+                <w:bCs/>
+              </w:rPr>
+              <w:t xml:space="preserve"> </w:t>
+            </w:r>
+            <w:proofErr w:type="spellStart"/>
+            <w:r>
+              <w:rPr>
+                <w:b/>
+                <w:bCs/>
+              </w:rPr>
+              <w:t>Met</w:t>
+            </w:r>
+            <w:r>
+              <w:t>Report</w:t>
+            </w:r>
+            <w:proofErr w:type="spellEnd"/>
+            <w:r>
+              <w:t xml:space="preserve"> has not met minimum requirements; evaluate only The Basics.</w:t>
             </w:r>
           </w:p>
         </w:tc>
       </w:tr>
       <w:tr>
         <w:trPr>
-          <w:trHeight w:val="5320"/>
+          <w:trHeight w:val="20"/>
         </w:trPr>
         <w:tc>
           <w:tcPr>
@@ -1133,18 +1505,18 @@
           <w:p>
             <w:r>
               <w:lastRenderedPageBreak/>
-              <w:t>This criterion is linked to a Learning OutcomeVisual Evidence &amp; Integration</w:t>
-            </w:r>
-          </w:p>
-          <w:p>
-            <w:r>
-              <w:t>Uses the decision matrix and at least three other purposeful visuals to clarify evidence and recommendations.</w:t>
+              <w:t>Research &amp; Source Documentation</w:t>
+            </w:r>
+          </w:p>
+          <w:p>
+            <w:r>
+              <w:t>Uses credible outside sources to establish criteria and support conclusions and recommendations.</w:t>
             </w:r>
           </w:p>
         </w:tc>
         <w:tc>
           <w:tcPr>
-            <w:tcW w:w="0" w:type="auto"/>
+            <w:tcW w:w="13257" w:type="dxa"/>
             <w:tcBorders>
               <w:top w:val="single" w:sz="6" w:space="0" w:color="E8EAEC"/>
               <w:left w:val="single" w:sz="6" w:space="0" w:color="E8EAEC"/>
@@ -1158,7 +1530,6 @@
               <w:bottom w:w="0" w:type="dxa"/>
               <w:right w:w="0" w:type="dxa"/>
             </w:tcMar>
-            <w:vAlign w:val="center"/>
             <w:hideMark/>
           </w:tcPr>
           <w:p>
@@ -1173,10 +1544,38 @@
                 <w:b/>
                 <w:bCs/>
               </w:rPr>
-              <w:t>5 ptsMeets or Exceeds</w:t>
-            </w:r>
-            <w:r>
-              <w:t>Visuals are relevant, legible, accessible, and helpful; each is numbered, descriptively captioned, cited in the preceding text, and placed alongside or after its first reference. Examples make document problems or solutions concrete.</w:t>
+              <w:t xml:space="preserve">5 </w:t>
+            </w:r>
+            <w:proofErr w:type="spellStart"/>
+            <w:r>
+              <w:rPr>
+                <w:b/>
+                <w:bCs/>
+              </w:rPr>
+              <w:t>ptsMeets</w:t>
+            </w:r>
+            <w:proofErr w:type="spellEnd"/>
+            <w:r>
+              <w:rPr>
+                <w:b/>
+                <w:bCs/>
+              </w:rPr>
+              <w:t xml:space="preserve"> or </w:t>
+            </w:r>
+            <w:proofErr w:type="spellStart"/>
+            <w:r>
+              <w:rPr>
+                <w:b/>
+                <w:bCs/>
+              </w:rPr>
+              <w:t>Exceeds</w:t>
+            </w:r>
+            <w:r>
+              <w:t>At</w:t>
+            </w:r>
+            <w:proofErr w:type="spellEnd"/>
+            <w:r>
+              <w:t xml:space="preserve"> least six relevant, credible outside sources are meaningfully integrated, including appropriate standards, guidelines, or research. In-text citations and reference entries consistently follow a discipline-appropriate style; all listed sources are cited.</w:t>
             </w:r>
           </w:p>
           <w:p>
@@ -1191,10 +1590,38 @@
                 <w:b/>
                 <w:bCs/>
               </w:rPr>
-              <w:t>4 ptsAlmost There</w:t>
-            </w:r>
-            <w:r>
-              <w:t>Visuals generally help readers, but some labels, captions, placement, references, legibility, or interpretation need improvement.</w:t>
+              <w:t xml:space="preserve">4 </w:t>
+            </w:r>
+            <w:proofErr w:type="spellStart"/>
+            <w:r>
+              <w:rPr>
+                <w:b/>
+                <w:bCs/>
+              </w:rPr>
+              <w:t>ptsAlmost</w:t>
+            </w:r>
+            <w:proofErr w:type="spellEnd"/>
+            <w:r>
+              <w:rPr>
+                <w:b/>
+                <w:bCs/>
+              </w:rPr>
+              <w:t xml:space="preserve"> </w:t>
+            </w:r>
+            <w:proofErr w:type="spellStart"/>
+            <w:r>
+              <w:rPr>
+                <w:b/>
+                <w:bCs/>
+              </w:rPr>
+              <w:t>There</w:t>
+            </w:r>
+            <w:r>
+              <w:t>Sources</w:t>
+            </w:r>
+            <w:proofErr w:type="spellEnd"/>
+            <w:r>
+              <w:t xml:space="preserve"> are generally credible and documented, but their integration, relevance, authority, or citation consistency needs improvement.</w:t>
             </w:r>
           </w:p>
           <w:p>
@@ -1209,10 +1636,38 @@
                 <w:b/>
                 <w:bCs/>
               </w:rPr>
-              <w:t>3 ptsNeeds Work</w:t>
-            </w:r>
-            <w:r>
-              <w:t>Visuals are confusing, poorly integrated, insufficiently explained, or do little to clarify the report.</w:t>
+              <w:t xml:space="preserve">3 </w:t>
+            </w:r>
+            <w:proofErr w:type="spellStart"/>
+            <w:r>
+              <w:rPr>
+                <w:b/>
+                <w:bCs/>
+              </w:rPr>
+              <w:t>ptsNeeds</w:t>
+            </w:r>
+            <w:proofErr w:type="spellEnd"/>
+            <w:r>
+              <w:rPr>
+                <w:b/>
+                <w:bCs/>
+              </w:rPr>
+              <w:t xml:space="preserve"> </w:t>
+            </w:r>
+            <w:proofErr w:type="spellStart"/>
+            <w:r>
+              <w:rPr>
+                <w:b/>
+                <w:bCs/>
+              </w:rPr>
+              <w:t>Work</w:t>
+            </w:r>
+            <w:r>
+              <w:t>Research</w:t>
+            </w:r>
+            <w:proofErr w:type="spellEnd"/>
+            <w:r>
+              <w:t xml:space="preserve"> is weakly connected to claims or criteria, relies on questionable sources, or contains recurring documentation problems.</w:t>
             </w:r>
           </w:p>
           <w:p>
@@ -1227,46 +1682,45 @@
                 <w:b/>
                 <w:bCs/>
               </w:rPr>
-              <w:t>0 ptsNot Met</w:t>
-            </w:r>
-            <w:r>
-              <w:t>Report has not met minimum requirements; evaluate only The Basics.</w:t>
-            </w:r>
-          </w:p>
-        </w:tc>
-        <w:tc>
-          <w:tcPr>
-            <w:tcW w:w="0" w:type="auto"/>
-            <w:tcBorders>
-              <w:top w:val="single" w:sz="6" w:space="0" w:color="E8EAEC"/>
-              <w:left w:val="single" w:sz="6" w:space="0" w:color="E8EAEC"/>
-              <w:bottom w:val="single" w:sz="6" w:space="0" w:color="E8EAEC"/>
-              <w:right w:val="single" w:sz="6" w:space="0" w:color="E8EAEC"/>
-            </w:tcBorders>
-            <w:shd w:val="clear" w:color="auto" w:fill="FFFFFF"/>
-            <w:noWrap/>
-            <w:tcMar>
-              <w:top w:w="105" w:type="dxa"/>
-              <w:left w:w="150" w:type="dxa"/>
-              <w:bottom w:w="105" w:type="dxa"/>
-              <w:right w:w="150" w:type="dxa"/>
-            </w:tcMar>
-            <w:vAlign w:val="center"/>
-            <w:hideMark/>
-          </w:tcPr>
-          <w:p>
-            <w:r>
-              <w:t>5 pts</w:t>
-            </w:r>
-            <w:r>
-              <w:br/>
+              <w:t xml:space="preserve">0 </w:t>
+            </w:r>
+            <w:proofErr w:type="spellStart"/>
+            <w:r>
+              <w:rPr>
+                <w:b/>
+                <w:bCs/>
+              </w:rPr>
+              <w:t>ptsNot</w:t>
+            </w:r>
+            <w:proofErr w:type="spellEnd"/>
+            <w:r>
+              <w:rPr>
+                <w:b/>
+                <w:bCs/>
+              </w:rPr>
+              <w:t xml:space="preserve"> </w:t>
+            </w:r>
+            <w:proofErr w:type="spellStart"/>
+            <w:r>
+              <w:rPr>
+                <w:b/>
+                <w:bCs/>
+              </w:rPr>
+              <w:t>Met</w:t>
+            </w:r>
+            <w:r>
+              <w:t>Report</w:t>
+            </w:r>
+            <w:proofErr w:type="spellEnd"/>
+            <w:r>
+              <w:t xml:space="preserve"> has not met minimum requirements; evaluate only The Basics.</w:t>
             </w:r>
           </w:p>
         </w:tc>
       </w:tr>
       <w:tr>
         <w:trPr>
-          <w:trHeight w:val="5931"/>
+          <w:trHeight w:val="20"/>
         </w:trPr>
         <w:tc>
           <w:tcPr>
@@ -1288,19 +1742,18 @@
           </w:tcPr>
           <w:p>
             <w:r>
-              <w:lastRenderedPageBreak/>
-              <w:t>This criterion is linked to a Learning OutcomeResearch &amp; Source Documentation</w:t>
-            </w:r>
-          </w:p>
-          <w:p>
-            <w:r>
-              <w:t>Uses credible outside sources to establish criteria and support conclusions and recommendations.</w:t>
+              <w:t>Organization, Design, Plain Language &amp; Professional Style</w:t>
+            </w:r>
+          </w:p>
+          <w:p>
+            <w:r>
+              <w:t>Produces a readable, accessible, polished workplace report that models the communication principles it recommends.</w:t>
             </w:r>
           </w:p>
         </w:tc>
         <w:tc>
           <w:tcPr>
-            <w:tcW w:w="0" w:type="auto"/>
+            <w:tcW w:w="13257" w:type="dxa"/>
             <w:tcBorders>
               <w:top w:val="single" w:sz="6" w:space="0" w:color="E8EAEC"/>
               <w:left w:val="single" w:sz="6" w:space="0" w:color="E8EAEC"/>
@@ -1314,7 +1767,6 @@
               <w:bottom w:w="0" w:type="dxa"/>
               <w:right w:w="0" w:type="dxa"/>
             </w:tcMar>
-            <w:vAlign w:val="center"/>
             <w:hideMark/>
           </w:tcPr>
           <w:p>
@@ -1329,10 +1781,38 @@
                 <w:b/>
                 <w:bCs/>
               </w:rPr>
-              <w:t>5 ptsMeets or Exceeds</w:t>
-            </w:r>
-            <w:r>
-              <w:t>At least six relevant, credible outside sources are meaningfully integrated, including appropriate standards, guidelines, or research. In-text citations and reference entries consistently follow a discipline-appropriate style; all listed sources are cited.</w:t>
+              <w:t xml:space="preserve">5 </w:t>
+            </w:r>
+            <w:proofErr w:type="spellStart"/>
+            <w:r>
+              <w:rPr>
+                <w:b/>
+                <w:bCs/>
+              </w:rPr>
+              <w:t>ptsMeets</w:t>
+            </w:r>
+            <w:proofErr w:type="spellEnd"/>
+            <w:r>
+              <w:rPr>
+                <w:b/>
+                <w:bCs/>
+              </w:rPr>
+              <w:t xml:space="preserve"> or </w:t>
+            </w:r>
+            <w:proofErr w:type="spellStart"/>
+            <w:r>
+              <w:rPr>
+                <w:b/>
+                <w:bCs/>
+              </w:rPr>
+              <w:t>Exceeds</w:t>
+            </w:r>
+            <w:r>
+              <w:t>Logical</w:t>
+            </w:r>
+            <w:proofErr w:type="spellEnd"/>
+            <w:r>
+              <w:t xml:space="preserve"> organization, informative hierarchical headings, page numbering, consistent formatting, and readable layout make the report easy to navigate. Writing is concise, precise, professional, and accessible, with few distracting errors.</w:t>
             </w:r>
           </w:p>
           <w:p>
@@ -1347,10 +1827,38 @@
                 <w:b/>
                 <w:bCs/>
               </w:rPr>
-              <w:t>4 ptsAlmost There</w:t>
-            </w:r>
-            <w:r>
-              <w:t>Sources are generally credible and documented, but their integration, relevance, authority, or citation consistency needs improvement.</w:t>
+              <w:t xml:space="preserve">4 </w:t>
+            </w:r>
+            <w:proofErr w:type="spellStart"/>
+            <w:r>
+              <w:rPr>
+                <w:b/>
+                <w:bCs/>
+              </w:rPr>
+              <w:t>ptsAlmost</w:t>
+            </w:r>
+            <w:proofErr w:type="spellEnd"/>
+            <w:r>
+              <w:rPr>
+                <w:b/>
+                <w:bCs/>
+              </w:rPr>
+              <w:t xml:space="preserve"> </w:t>
+            </w:r>
+            <w:proofErr w:type="spellStart"/>
+            <w:r>
+              <w:rPr>
+                <w:b/>
+                <w:bCs/>
+              </w:rPr>
+              <w:t>There</w:t>
+            </w:r>
+            <w:r>
+              <w:t>Document</w:t>
+            </w:r>
+            <w:proofErr w:type="spellEnd"/>
+            <w:r>
+              <w:t xml:space="preserve"> is generally clear and professional but has occasional issues with hierarchy, consistency, wording, readability, or editing.</w:t>
             </w:r>
           </w:p>
           <w:p>
@@ -1365,10 +1873,38 @@
                 <w:b/>
                 <w:bCs/>
               </w:rPr>
-              <w:t>3 ptsNeeds Work</w:t>
-            </w:r>
-            <w:r>
-              <w:t>Research is weakly connected to claims or criteria, relies on questionable sources, or contains recurring documentation problems.</w:t>
+              <w:t xml:space="preserve">3 </w:t>
+            </w:r>
+            <w:proofErr w:type="spellStart"/>
+            <w:r>
+              <w:rPr>
+                <w:b/>
+                <w:bCs/>
+              </w:rPr>
+              <w:t>ptsNeeds</w:t>
+            </w:r>
+            <w:proofErr w:type="spellEnd"/>
+            <w:r>
+              <w:rPr>
+                <w:b/>
+                <w:bCs/>
+              </w:rPr>
+              <w:t xml:space="preserve"> </w:t>
+            </w:r>
+            <w:proofErr w:type="spellStart"/>
+            <w:r>
+              <w:rPr>
+                <w:b/>
+                <w:bCs/>
+              </w:rPr>
+              <w:t>Work</w:t>
+            </w:r>
+            <w:r>
+              <w:t>Recurring</w:t>
+            </w:r>
+            <w:proofErr w:type="spellEnd"/>
+            <w:r>
+              <w:t xml:space="preserve"> issues with organization, layout, accessibility, plain language, or editing reduce professional effectiveness.</w:t>
             </w:r>
           </w:p>
           <w:p>
@@ -1383,208 +1919,46 @@
                 <w:b/>
                 <w:bCs/>
               </w:rPr>
-              <w:t>0 ptsNot Met</w:t>
-            </w:r>
-            <w:r>
-              <w:t>Report has not met minimum requirements; evaluate only The Basics.</w:t>
-            </w:r>
-          </w:p>
-        </w:tc>
-        <w:tc>
-          <w:tcPr>
-            <w:tcW w:w="0" w:type="auto"/>
-            <w:tcBorders>
-              <w:top w:val="single" w:sz="6" w:space="0" w:color="E8EAEC"/>
-              <w:left w:val="single" w:sz="6" w:space="0" w:color="E8EAEC"/>
-              <w:bottom w:val="single" w:sz="6" w:space="0" w:color="E8EAEC"/>
-              <w:right w:val="single" w:sz="6" w:space="0" w:color="E8EAEC"/>
-            </w:tcBorders>
-            <w:shd w:val="clear" w:color="auto" w:fill="FFFFFF"/>
-            <w:noWrap/>
-            <w:tcMar>
-              <w:top w:w="105" w:type="dxa"/>
-              <w:left w:w="150" w:type="dxa"/>
-              <w:bottom w:w="105" w:type="dxa"/>
-              <w:right w:w="150" w:type="dxa"/>
-            </w:tcMar>
-            <w:vAlign w:val="center"/>
-            <w:hideMark/>
-          </w:tcPr>
-          <w:p>
-            <w:r>
-              <w:t>5 pts</w:t>
-            </w:r>
-            <w:r>
-              <w:br/>
-            </w:r>
-          </w:p>
-        </w:tc>
-      </w:tr>
-      <w:tr>
-        <w:trPr>
-          <w:trHeight w:val="5931"/>
-        </w:trPr>
-        <w:tc>
-          <w:tcPr>
-            <w:tcW w:w="0" w:type="auto"/>
-            <w:tcBorders>
-              <w:top w:val="single" w:sz="6" w:space="0" w:color="E8EAEC"/>
-              <w:left w:val="single" w:sz="6" w:space="0" w:color="E8EAEC"/>
-              <w:bottom w:val="single" w:sz="6" w:space="0" w:color="E8EAEC"/>
-              <w:right w:val="single" w:sz="6" w:space="0" w:color="E8EAEC"/>
-            </w:tcBorders>
-            <w:shd w:val="clear" w:color="auto" w:fill="FFFFFF"/>
-            <w:tcMar>
-              <w:top w:w="180" w:type="dxa"/>
-              <w:left w:w="150" w:type="dxa"/>
-              <w:bottom w:w="180" w:type="dxa"/>
-              <w:right w:w="150" w:type="dxa"/>
-            </w:tcMar>
-            <w:hideMark/>
-          </w:tcPr>
-          <w:p>
-            <w:r>
-              <w:lastRenderedPageBreak/>
-              <w:t>This criterion is linked to a Learning OutcomeOrganization, Design, Plain Language &amp; Professional Style</w:t>
-            </w:r>
-          </w:p>
-          <w:p>
-            <w:r>
-              <w:t>Produces a readable, accessible, polished workplace report that models the communication principles it recommends.</w:t>
-            </w:r>
-          </w:p>
-        </w:tc>
-        <w:tc>
-          <w:tcPr>
-            <w:tcW w:w="0" w:type="auto"/>
-            <w:tcBorders>
-              <w:top w:val="single" w:sz="6" w:space="0" w:color="E8EAEC"/>
-              <w:left w:val="single" w:sz="6" w:space="0" w:color="E8EAEC"/>
-              <w:bottom w:val="single" w:sz="6" w:space="0" w:color="E8EAEC"/>
-              <w:right w:val="single" w:sz="6" w:space="0" w:color="E8EAEC"/>
-            </w:tcBorders>
-            <w:shd w:val="clear" w:color="auto" w:fill="FFFFFF"/>
-            <w:tcMar>
-              <w:top w:w="0" w:type="dxa"/>
-              <w:left w:w="0" w:type="dxa"/>
-              <w:bottom w:w="0" w:type="dxa"/>
-              <w:right w:w="0" w:type="dxa"/>
-            </w:tcMar>
-            <w:vAlign w:val="center"/>
-            <w:hideMark/>
-          </w:tcPr>
-          <w:p>
-            <w:pPr>
-              <w:rPr>
-                <w:b/>
-                <w:bCs/>
-              </w:rPr>
-            </w:pPr>
-            <w:r>
-              <w:rPr>
-                <w:b/>
-                <w:bCs/>
-              </w:rPr>
-              <w:t>5 ptsMeets or Exceeds</w:t>
-            </w:r>
-            <w:r>
-              <w:t>Logical organization, informative hierarchical headings, page numbering, consistent formatting, and readable layout make the report easy to navigate. Writing is concise, precise, professional, and accessible, with few distracting errors.</w:t>
-            </w:r>
-          </w:p>
-          <w:p>
-            <w:pPr>
-              <w:rPr>
-                <w:b/>
-                <w:bCs/>
-              </w:rPr>
-            </w:pPr>
-            <w:r>
-              <w:rPr>
-                <w:b/>
-                <w:bCs/>
-              </w:rPr>
-              <w:t>4 ptsAlmost There</w:t>
-            </w:r>
-            <w:r>
-              <w:t>Document is generally clear and professional but has occasional issues with hierarchy, consistency, wording, readability, or editing.</w:t>
-            </w:r>
-          </w:p>
-          <w:p>
-            <w:pPr>
-              <w:rPr>
-                <w:b/>
-                <w:bCs/>
-              </w:rPr>
-            </w:pPr>
-            <w:r>
-              <w:rPr>
-                <w:b/>
-                <w:bCs/>
-              </w:rPr>
-              <w:t>3 ptsNeeds Work</w:t>
-            </w:r>
-            <w:r>
-              <w:t>Recurring issues with organization, layout, accessibility, plain language, or editing reduce professional effectiveness.</w:t>
-            </w:r>
-          </w:p>
-          <w:p>
-            <w:pPr>
-              <w:rPr>
-                <w:b/>
-                <w:bCs/>
-              </w:rPr>
-            </w:pPr>
-            <w:r>
-              <w:rPr>
-                <w:b/>
-                <w:bCs/>
-              </w:rPr>
-              <w:t>0 ptsNot Met</w:t>
-            </w:r>
-            <w:r>
-              <w:t>Report has not met minimum requirements; evaluate only The Basics.</w:t>
-            </w:r>
-          </w:p>
-        </w:tc>
-        <w:tc>
-          <w:tcPr>
-            <w:tcW w:w="0" w:type="auto"/>
-            <w:tcBorders>
-              <w:top w:val="single" w:sz="6" w:space="0" w:color="E8EAEC"/>
-              <w:left w:val="single" w:sz="6" w:space="0" w:color="E8EAEC"/>
-              <w:bottom w:val="single" w:sz="6" w:space="0" w:color="E8EAEC"/>
-              <w:right w:val="single" w:sz="6" w:space="0" w:color="E8EAEC"/>
-            </w:tcBorders>
-            <w:shd w:val="clear" w:color="auto" w:fill="FFFFFF"/>
-            <w:noWrap/>
-            <w:tcMar>
-              <w:top w:w="105" w:type="dxa"/>
-              <w:left w:w="150" w:type="dxa"/>
-              <w:bottom w:w="105" w:type="dxa"/>
-              <w:right w:w="150" w:type="dxa"/>
-            </w:tcMar>
-            <w:vAlign w:val="center"/>
-            <w:hideMark/>
-          </w:tcPr>
-          <w:p>
-            <w:r>
-              <w:t>5 pts</w:t>
-            </w:r>
-            <w:r>
-              <w:br/>
+              <w:t xml:space="preserve">0 </w:t>
+            </w:r>
+            <w:proofErr w:type="spellStart"/>
+            <w:r>
+              <w:rPr>
+                <w:b/>
+                <w:bCs/>
+              </w:rPr>
+              <w:t>ptsNot</w:t>
+            </w:r>
+            <w:proofErr w:type="spellEnd"/>
+            <w:r>
+              <w:rPr>
+                <w:b/>
+                <w:bCs/>
+              </w:rPr>
+              <w:t xml:space="preserve"> </w:t>
+            </w:r>
+            <w:proofErr w:type="spellStart"/>
+            <w:r>
+              <w:rPr>
+                <w:b/>
+                <w:bCs/>
+              </w:rPr>
+              <w:t>Met</w:t>
+            </w:r>
+            <w:r>
+              <w:t>Report</w:t>
+            </w:r>
+            <w:proofErr w:type="spellEnd"/>
+            <w:r>
+              <w:t xml:space="preserve"> has not met minimum requirements; evaluate only The Basics.</w:t>
             </w:r>
           </w:p>
         </w:tc>
       </w:tr>
     </w:tbl>
-    <w:p>
-      <w:r>
-        <w:t>Total Points: 175</w:t>
-      </w:r>
-    </w:p>
     <w:p/>
     <w:sectPr>
-      <w:pgSz w:w="12240" w:h="15840"/>
+      <w:pgSz w:w="20160" w:h="12240" w:orient="landscape" w:code="5"/>
       <w:pgMar w:top="1440" w:right="1440" w:bottom="1440" w:left="1440" w:header="720" w:footer="720" w:gutter="0"/>
       <w:cols w:space="720"/>
       <w:docGrid w:linePitch="360"/>

</xml_diff>